<commit_message>
Integrate Saidu Ahmed Alkali governance profile
</commit_message>
<xml_diff>
--- a/reports/governance_report.docx
+++ b/reports/governance_report.docx
@@ -189,6 +189,58 @@
           </w:tcPr>
           <w:p>
             <w:r>
+              <w:t>Hon. Saidu Ahmed Alkali</w:t>
+            </w:r>
+          </w:p>
+        </w:tc>
+        <w:tc>
+          <w:tcPr>
+            <w:tcW w:type="dxa" w:w="1958"/>
+          </w:tcPr>
+          <w:p>
+            <w:r>
+              <w:t>54.28</w:t>
+            </w:r>
+          </w:p>
+        </w:tc>
+        <w:tc>
+          <w:tcPr>
+            <w:tcW w:type="dxa" w:w="1958"/>
+          </w:tcPr>
+          <w:p>
+            <w:r>
+              <w:t>15</w:t>
+            </w:r>
+          </w:p>
+        </w:tc>
+        <w:tc>
+          <w:tcPr>
+            <w:tcW w:type="dxa" w:w="1958"/>
+          </w:tcPr>
+          <w:p>
+            <w:r>
+              <w:t>2</w:t>
+            </w:r>
+          </w:p>
+        </w:tc>
+        <w:tc>
+          <w:tcPr>
+            <w:tcW w:type="dxa" w:w="1958"/>
+          </w:tcPr>
+          <w:p>
+            <w:r>
+              <w:t>100.0</w:t>
+            </w:r>
+          </w:p>
+        </w:tc>
+      </w:tr>
+      <w:tr>
+        <w:tc>
+          <w:tcPr>
+            <w:tcW w:type="dxa" w:w="1958"/>
+          </w:tcPr>
+          <w:p>
+            <w:r>
               <w:t>Dr. Jamilu Isyaku Gwamna</w:t>
             </w:r>
           </w:p>
@@ -1188,6 +1240,378 @@
           <w:p>
             <w:r>
               <w:t>39.44</w:t>
+            </w:r>
+          </w:p>
+        </w:tc>
+        <w:tc>
+          <w:tcPr>
+            <w:tcW w:type="dxa" w:w="1632"/>
+          </w:tcPr>
+          <w:p>
+            <w:r>
+              <w:t>1</w:t>
+            </w:r>
+          </w:p>
+        </w:tc>
+        <w:tc>
+          <w:tcPr>
+            <w:tcW w:type="dxa" w:w="1632"/>
+          </w:tcPr>
+          <w:p>
+            <w:r>
+              <w:t>qualitative_only</w:t>
+            </w:r>
+          </w:p>
+        </w:tc>
+      </w:tr>
+      <w:tr>
+        <w:tc>
+          <w:tcPr>
+            <w:tcW w:type="dxa" w:w="1632"/>
+          </w:tcPr>
+          <w:p>
+            <w:r>
+              <w:t>Hon. Saidu Ahmed Alkali</w:t>
+            </w:r>
+          </w:p>
+        </w:tc>
+        <w:tc>
+          <w:tcPr>
+            <w:tcW w:type="dxa" w:w="1632"/>
+          </w:tcPr>
+          <w:p>
+            <w:r>
+              <w:t>Infrastructure</w:t>
+            </w:r>
+          </w:p>
+        </w:tc>
+        <w:tc>
+          <w:tcPr>
+            <w:tcW w:type="dxa" w:w="1632"/>
+          </w:tcPr>
+          <w:p>
+            <w:r>
+              <w:t>0.2</w:t>
+            </w:r>
+          </w:p>
+        </w:tc>
+        <w:tc>
+          <w:tcPr>
+            <w:tcW w:type="dxa" w:w="1632"/>
+          </w:tcPr>
+          <w:p>
+            <w:r>
+              <w:t>57.73</w:t>
+            </w:r>
+          </w:p>
+        </w:tc>
+        <w:tc>
+          <w:tcPr>
+            <w:tcW w:type="dxa" w:w="1632"/>
+          </w:tcPr>
+          <w:p>
+            <w:r>
+              <w:t>3</w:t>
+            </w:r>
+          </w:p>
+        </w:tc>
+        <w:tc>
+          <w:tcPr>
+            <w:tcW w:type="dxa" w:w="1632"/>
+          </w:tcPr>
+          <w:p>
+            <w:r>
+              <w:t>qualitative_only</w:t>
+            </w:r>
+          </w:p>
+        </w:tc>
+      </w:tr>
+      <w:tr>
+        <w:tc>
+          <w:tcPr>
+            <w:tcW w:type="dxa" w:w="1632"/>
+          </w:tcPr>
+          <w:p>
+            <w:r>
+              <w:t>Hon. Saidu Ahmed Alkali</w:t>
+            </w:r>
+          </w:p>
+        </w:tc>
+        <w:tc>
+          <w:tcPr>
+            <w:tcW w:type="dxa" w:w="1632"/>
+          </w:tcPr>
+          <w:p>
+            <w:r>
+              <w:t>Economy</w:t>
+            </w:r>
+          </w:p>
+        </w:tc>
+        <w:tc>
+          <w:tcPr>
+            <w:tcW w:type="dxa" w:w="1632"/>
+          </w:tcPr>
+          <w:p>
+            <w:r>
+              <w:t>0.2</w:t>
+            </w:r>
+          </w:p>
+        </w:tc>
+        <w:tc>
+          <w:tcPr>
+            <w:tcW w:type="dxa" w:w="1632"/>
+          </w:tcPr>
+          <w:p>
+            <w:r>
+              <w:t>60.89</w:t>
+            </w:r>
+          </w:p>
+        </w:tc>
+        <w:tc>
+          <w:tcPr>
+            <w:tcW w:type="dxa" w:w="1632"/>
+          </w:tcPr>
+          <w:p>
+            <w:r>
+              <w:t>4</w:t>
+            </w:r>
+          </w:p>
+        </w:tc>
+        <w:tc>
+          <w:tcPr>
+            <w:tcW w:type="dxa" w:w="1632"/>
+          </w:tcPr>
+          <w:p>
+            <w:r>
+              <w:t>quantitative_or_mixed</w:t>
+            </w:r>
+          </w:p>
+        </w:tc>
+      </w:tr>
+      <w:tr>
+        <w:tc>
+          <w:tcPr>
+            <w:tcW w:type="dxa" w:w="1632"/>
+          </w:tcPr>
+          <w:p>
+            <w:r>
+              <w:t>Hon. Saidu Ahmed Alkali</w:t>
+            </w:r>
+          </w:p>
+        </w:tc>
+        <w:tc>
+          <w:tcPr>
+            <w:tcW w:type="dxa" w:w="1632"/>
+          </w:tcPr>
+          <w:p>
+            <w:r>
+              <w:t>Youth Empowerment</w:t>
+            </w:r>
+          </w:p>
+        </w:tc>
+        <w:tc>
+          <w:tcPr>
+            <w:tcW w:type="dxa" w:w="1632"/>
+          </w:tcPr>
+          <w:p>
+            <w:r>
+              <w:t>0.2</w:t>
+            </w:r>
+          </w:p>
+        </w:tc>
+        <w:tc>
+          <w:tcPr>
+            <w:tcW w:type="dxa" w:w="1632"/>
+          </w:tcPr>
+          <w:p>
+            <w:r>
+              <w:t>46.24</w:t>
+            </w:r>
+          </w:p>
+        </w:tc>
+        <w:tc>
+          <w:tcPr>
+            <w:tcW w:type="dxa" w:w="1632"/>
+          </w:tcPr>
+          <w:p>
+            <w:r>
+              <w:t>1</w:t>
+            </w:r>
+          </w:p>
+        </w:tc>
+        <w:tc>
+          <w:tcPr>
+            <w:tcW w:type="dxa" w:w="1632"/>
+          </w:tcPr>
+          <w:p>
+            <w:r>
+              <w:t>qualitative_only</w:t>
+            </w:r>
+          </w:p>
+        </w:tc>
+      </w:tr>
+      <w:tr>
+        <w:tc>
+          <w:tcPr>
+            <w:tcW w:type="dxa" w:w="1632"/>
+          </w:tcPr>
+          <w:p>
+            <w:r>
+              <w:t>Hon. Saidu Ahmed Alkali</w:t>
+            </w:r>
+          </w:p>
+        </w:tc>
+        <w:tc>
+          <w:tcPr>
+            <w:tcW w:type="dxa" w:w="1632"/>
+          </w:tcPr>
+          <w:p>
+            <w:r>
+              <w:t>Crisis Handling</w:t>
+            </w:r>
+          </w:p>
+        </w:tc>
+        <w:tc>
+          <w:tcPr>
+            <w:tcW w:type="dxa" w:w="1632"/>
+          </w:tcPr>
+          <w:p>
+            <w:r>
+              <w:t>0.15</w:t>
+            </w:r>
+          </w:p>
+        </w:tc>
+        <w:tc>
+          <w:tcPr>
+            <w:tcW w:type="dxa" w:w="1632"/>
+          </w:tcPr>
+          <w:p>
+            <w:r>
+              <w:t>58.96</w:t>
+            </w:r>
+          </w:p>
+        </w:tc>
+        <w:tc>
+          <w:tcPr>
+            <w:tcW w:type="dxa" w:w="1632"/>
+          </w:tcPr>
+          <w:p>
+            <w:r>
+              <w:t>1</w:t>
+            </w:r>
+          </w:p>
+        </w:tc>
+        <w:tc>
+          <w:tcPr>
+            <w:tcW w:type="dxa" w:w="1632"/>
+          </w:tcPr>
+          <w:p>
+            <w:r>
+              <w:t>qualitative_only</w:t>
+            </w:r>
+          </w:p>
+        </w:tc>
+      </w:tr>
+      <w:tr>
+        <w:tc>
+          <w:tcPr>
+            <w:tcW w:type="dxa" w:w="1632"/>
+          </w:tcPr>
+          <w:p>
+            <w:r>
+              <w:t>Hon. Saidu Ahmed Alkali</w:t>
+            </w:r>
+          </w:p>
+        </w:tc>
+        <w:tc>
+          <w:tcPr>
+            <w:tcW w:type="dxa" w:w="1632"/>
+          </w:tcPr>
+          <w:p>
+            <w:r>
+              <w:t>Transparency</w:t>
+            </w:r>
+          </w:p>
+        </w:tc>
+        <w:tc>
+          <w:tcPr>
+            <w:tcW w:type="dxa" w:w="1632"/>
+          </w:tcPr>
+          <w:p>
+            <w:r>
+              <w:t>0.1</w:t>
+            </w:r>
+          </w:p>
+        </w:tc>
+        <w:tc>
+          <w:tcPr>
+            <w:tcW w:type="dxa" w:w="1632"/>
+          </w:tcPr>
+          <w:p>
+            <w:r>
+              <w:t>44.99</w:t>
+            </w:r>
+          </w:p>
+        </w:tc>
+        <w:tc>
+          <w:tcPr>
+            <w:tcW w:type="dxa" w:w="1632"/>
+          </w:tcPr>
+          <w:p>
+            <w:r>
+              <w:t>3</w:t>
+            </w:r>
+          </w:p>
+        </w:tc>
+        <w:tc>
+          <w:tcPr>
+            <w:tcW w:type="dxa" w:w="1632"/>
+          </w:tcPr>
+          <w:p>
+            <w:r>
+              <w:t>qualitative_only</w:t>
+            </w:r>
+          </w:p>
+        </w:tc>
+      </w:tr>
+      <w:tr>
+        <w:tc>
+          <w:tcPr>
+            <w:tcW w:type="dxa" w:w="1632"/>
+          </w:tcPr>
+          <w:p>
+            <w:r>
+              <w:t>Hon. Saidu Ahmed Alkali</w:t>
+            </w:r>
+          </w:p>
+        </w:tc>
+        <w:tc>
+          <w:tcPr>
+            <w:tcW w:type="dxa" w:w="1632"/>
+          </w:tcPr>
+          <w:p>
+            <w:r>
+              <w:t>Public Utility Management</w:t>
+            </w:r>
+          </w:p>
+        </w:tc>
+        <w:tc>
+          <w:tcPr>
+            <w:tcW w:type="dxa" w:w="1632"/>
+          </w:tcPr>
+          <w:p>
+            <w:r>
+              <w:t>0.1</w:t>
+            </w:r>
+          </w:p>
+        </w:tc>
+        <w:tc>
+          <w:tcPr>
+            <w:tcW w:type="dxa" w:w="1632"/>
+          </w:tcPr>
+          <w:p>
+            <w:r>
+              <w:t>51.68</w:t>
             </w:r>
           </w:p>
         </w:tc>

</xml_diff>

<commit_message>
Expand leadership lifecycle analysis
</commit_message>
<xml_diff>
--- a/reports/governance_report.docx
+++ b/reports/governance_report.docx
@@ -28,7 +28,7 @@
     </w:p>
     <w:p>
       <w:r>
-        <w:t>This project is an independent governance analytics and civic-tech research platform based on publicly available information.</w:t>
+        <w:t>This platform is an independent civic-tech and governance analytics research project based on publicly available information and evidence-based analysis. It does not represent any political party, candidate, or government institution.</w:t>
       </w:r>
     </w:p>
     <w:p>
@@ -3031,6 +3031,1931 @@
           <w:p>
             <w:r>
               <w:t>SRC009</w:t>
+            </w:r>
+          </w:p>
+        </w:tc>
+      </w:tr>
+    </w:tbl>
+    <w:p>
+      <w:pPr>
+        <w:pStyle w:val="Heading1"/>
+      </w:pPr>
+      <w:r>
+        <w:t>Leadership Journey Timeline</w:t>
+      </w:r>
+    </w:p>
+    <w:tbl>
+      <w:tblPr>
+        <w:tblStyle w:val="TableGrid"/>
+        <w:tblW w:type="auto" w:w="0"/>
+        <w:jc w:val="center"/>
+        <w:tblLook w:firstColumn="1" w:firstRow="1" w:lastColumn="0" w:lastRow="0" w:noHBand="0" w:noVBand="1" w:val="04A0"/>
+      </w:tblPr>
+      <w:tblGrid>
+        <w:gridCol w:w="1399"/>
+        <w:gridCol w:w="1399"/>
+        <w:gridCol w:w="1399"/>
+        <w:gridCol w:w="1399"/>
+        <w:gridCol w:w="1399"/>
+        <w:gridCol w:w="1399"/>
+        <w:gridCol w:w="1399"/>
+      </w:tblGrid>
+      <w:tr>
+        <w:tc>
+          <w:tcPr>
+            <w:tcW w:type="dxa" w:w="1399"/>
+          </w:tcPr>
+          <w:p>
+            <w:r>
+              <w:rPr>
+                <w:b/>
+                <w:color w:val="0B1F3A"/>
+              </w:rPr>
+              <w:t>candidate_name</w:t>
+            </w:r>
+          </w:p>
+        </w:tc>
+        <w:tc>
+          <w:tcPr>
+            <w:tcW w:type="dxa" w:w="1399"/>
+          </w:tcPr>
+          <w:p>
+            <w:r>
+              <w:rPr>
+                <w:b/>
+                <w:color w:val="0B1F3A"/>
+              </w:rPr>
+              <w:t>life_stage</w:t>
+            </w:r>
+          </w:p>
+        </w:tc>
+        <w:tc>
+          <w:tcPr>
+            <w:tcW w:type="dxa" w:w="1399"/>
+          </w:tcPr>
+          <w:p>
+            <w:r>
+              <w:rPr>
+                <w:b/>
+                <w:color w:val="0B1F3A"/>
+              </w:rPr>
+              <w:t>year_or_period</w:t>
+            </w:r>
+          </w:p>
+        </w:tc>
+        <w:tc>
+          <w:tcPr>
+            <w:tcW w:type="dxa" w:w="1399"/>
+          </w:tcPr>
+          <w:p>
+            <w:r>
+              <w:rPr>
+                <w:b/>
+                <w:color w:val="0B1F3A"/>
+              </w:rPr>
+              <w:t>role_or_event</w:t>
+            </w:r>
+          </w:p>
+        </w:tc>
+        <w:tc>
+          <w:tcPr>
+            <w:tcW w:type="dxa" w:w="1399"/>
+          </w:tcPr>
+          <w:p>
+            <w:r>
+              <w:rPr>
+                <w:b/>
+                <w:color w:val="0B1F3A"/>
+              </w:rPr>
+              <w:t>institution</w:t>
+            </w:r>
+          </w:p>
+        </w:tc>
+        <w:tc>
+          <w:tcPr>
+            <w:tcW w:type="dxa" w:w="1399"/>
+          </w:tcPr>
+          <w:p>
+            <w:r>
+              <w:rPr>
+                <w:b/>
+                <w:color w:val="0B1F3A"/>
+              </w:rPr>
+              <w:t>citation</w:t>
+            </w:r>
+          </w:p>
+        </w:tc>
+        <w:tc>
+          <w:tcPr>
+            <w:tcW w:type="dxa" w:w="1399"/>
+          </w:tcPr>
+          <w:p>
+            <w:r>
+              <w:rPr>
+                <w:b/>
+                <w:color w:val="0B1F3A"/>
+              </w:rPr>
+              <w:t>impact_score</w:t>
+            </w:r>
+          </w:p>
+        </w:tc>
+      </w:tr>
+      <w:tr>
+        <w:tc>
+          <w:tcPr>
+            <w:tcW w:type="dxa" w:w="1399"/>
+          </w:tcPr>
+          <w:p>
+            <w:r>
+              <w:t>Dr. Jamilu Isyaku Gwamna</w:t>
+            </w:r>
+          </w:p>
+        </w:tc>
+        <w:tc>
+          <w:tcPr>
+            <w:tcW w:type="dxa" w:w="1399"/>
+          </w:tcPr>
+          <w:p>
+            <w:r>
+              <w:t>Early background</w:t>
+            </w:r>
+          </w:p>
+        </w:tc>
+        <w:tc>
+          <w:tcPr>
+            <w:tcW w:type="dxa" w:w="1399"/>
+          </w:tcPr>
+          <w:p>
+            <w:r>
+              <w:t>Publicly unavailable</w:t>
+            </w:r>
+          </w:p>
+        </w:tc>
+        <w:tc>
+          <w:tcPr>
+            <w:tcW w:type="dxa" w:w="1399"/>
+          </w:tcPr>
+          <w:p>
+            <w:r>
+              <w:t>Childhood and family background not verified in seed public records</w:t>
+            </w:r>
+          </w:p>
+        </w:tc>
+        <w:tc>
+          <w:tcPr>
+            <w:tcW w:type="dxa" w:w="1399"/>
+          </w:tcPr>
+          <w:p>
+            <w:r>
+              <w:t>Not available</w:t>
+            </w:r>
+          </w:p>
+        </w:tc>
+        <w:tc>
+          <w:tcPr>
+            <w:tcW w:type="dxa" w:w="1399"/>
+          </w:tcPr>
+          <w:p>
+            <w:r>
+              <w:t>SRC006</w:t>
+            </w:r>
+          </w:p>
+        </w:tc>
+        <w:tc>
+          <w:tcPr>
+            <w:tcW w:type="dxa" w:w="1399"/>
+          </w:tcPr>
+          <w:p>
+            <w:r>
+              <w:t>0</w:t>
+            </w:r>
+          </w:p>
+        </w:tc>
+      </w:tr>
+      <w:tr>
+        <w:tc>
+          <w:tcPr>
+            <w:tcW w:type="dxa" w:w="1399"/>
+          </w:tcPr>
+          <w:p>
+            <w:r>
+              <w:t>Dr. Jamilu Isyaku Gwamna</w:t>
+            </w:r>
+          </w:p>
+        </w:tc>
+        <w:tc>
+          <w:tcPr>
+            <w:tcW w:type="dxa" w:w="1399"/>
+          </w:tcPr>
+          <w:p>
+            <w:r>
+              <w:t>Education</w:t>
+            </w:r>
+          </w:p>
+        </w:tc>
+        <w:tc>
+          <w:tcPr>
+            <w:tcW w:type="dxa" w:w="1399"/>
+          </w:tcPr>
+          <w:p>
+            <w:r>
+              <w:t>Period not specified</w:t>
+            </w:r>
+          </w:p>
+        </w:tc>
+        <w:tc>
+          <w:tcPr>
+            <w:tcW w:type="dxa" w:w="1399"/>
+          </w:tcPr>
+          <w:p>
+            <w:r>
+              <w:t>Accounting and economics qualifications reported</w:t>
+            </w:r>
+          </w:p>
+        </w:tc>
+        <w:tc>
+          <w:tcPr>
+            <w:tcW w:type="dxa" w:w="1399"/>
+          </w:tcPr>
+          <w:p>
+            <w:r>
+              <w:t>Ahmadu Bello University; London Metropolitan University</w:t>
+            </w:r>
+          </w:p>
+        </w:tc>
+        <w:tc>
+          <w:tcPr>
+            <w:tcW w:type="dxa" w:w="1399"/>
+          </w:tcPr>
+          <w:p>
+            <w:r>
+              <w:t>SRC034</w:t>
+            </w:r>
+          </w:p>
+        </w:tc>
+        <w:tc>
+          <w:tcPr>
+            <w:tcW w:type="dxa" w:w="1399"/>
+          </w:tcPr>
+          <w:p>
+            <w:r>
+              <w:t>48</w:t>
+            </w:r>
+          </w:p>
+        </w:tc>
+      </w:tr>
+      <w:tr>
+        <w:tc>
+          <w:tcPr>
+            <w:tcW w:type="dxa" w:w="1399"/>
+          </w:tcPr>
+          <w:p>
+            <w:r>
+              <w:t>Dr. Jamilu Isyaku Gwamna</w:t>
+            </w:r>
+          </w:p>
+        </w:tc>
+        <w:tc>
+          <w:tcPr>
+            <w:tcW w:type="dxa" w:w="1399"/>
+          </w:tcPr>
+          <w:p>
+            <w:r>
+              <w:t>Early career</w:t>
+            </w:r>
+          </w:p>
+        </w:tc>
+        <w:tc>
+          <w:tcPr>
+            <w:tcW w:type="dxa" w:w="1399"/>
+          </w:tcPr>
+          <w:p>
+            <w:r>
+              <w:t>By 2013</w:t>
+            </w:r>
+          </w:p>
+        </w:tc>
+        <w:tc>
+          <w:tcPr>
+            <w:tcW w:type="dxa" w:w="1399"/>
+          </w:tcPr>
+          <w:p>
+            <w:r>
+              <w:t>Private-sector utility executive during electricity distribution privatization period</w:t>
+            </w:r>
+          </w:p>
+        </w:tc>
+        <w:tc>
+          <w:tcPr>
+            <w:tcW w:type="dxa" w:w="1399"/>
+          </w:tcPr>
+          <w:p>
+            <w:r>
+              <w:t>Kano Electricity Distribution Company</w:t>
+            </w:r>
+          </w:p>
+        </w:tc>
+        <w:tc>
+          <w:tcPr>
+            <w:tcW w:type="dxa" w:w="1399"/>
+          </w:tcPr>
+          <w:p>
+            <w:r>
+              <w:t>SRC007</w:t>
+            </w:r>
+          </w:p>
+        </w:tc>
+        <w:tc>
+          <w:tcPr>
+            <w:tcW w:type="dxa" w:w="1399"/>
+          </w:tcPr>
+          <w:p>
+            <w:r>
+              <w:t>66</w:t>
+            </w:r>
+          </w:p>
+        </w:tc>
+      </w:tr>
+      <w:tr>
+        <w:tc>
+          <w:tcPr>
+            <w:tcW w:type="dxa" w:w="1399"/>
+          </w:tcPr>
+          <w:p>
+            <w:r>
+              <w:t>Dr. Jamilu Isyaku Gwamna</w:t>
+            </w:r>
+          </w:p>
+        </w:tc>
+        <w:tc>
+          <w:tcPr>
+            <w:tcW w:type="dxa" w:w="1399"/>
+          </w:tcPr>
+          <w:p>
+            <w:r>
+              <w:t>Professional growth</w:t>
+            </w:r>
+          </w:p>
+        </w:tc>
+        <w:tc>
+          <w:tcPr>
+            <w:tcW w:type="dxa" w:w="1399"/>
+          </w:tcPr>
+          <w:p>
+            <w:r>
+              <w:t>Pre-2013</w:t>
+            </w:r>
+          </w:p>
+        </w:tc>
+        <w:tc>
+          <w:tcPr>
+            <w:tcW w:type="dxa" w:w="1399"/>
+          </w:tcPr>
+          <w:p>
+            <w:r>
+              <w:t>Multi-sector professional experience reported</w:t>
+            </w:r>
+          </w:p>
+        </w:tc>
+        <w:tc>
+          <w:tcPr>
+            <w:tcW w:type="dxa" w:w="1399"/>
+          </w:tcPr>
+          <w:p>
+            <w:r>
+              <w:t>Business and utility-sector institutions</w:t>
+            </w:r>
+          </w:p>
+        </w:tc>
+        <w:tc>
+          <w:tcPr>
+            <w:tcW w:type="dxa" w:w="1399"/>
+          </w:tcPr>
+          <w:p>
+            <w:r>
+              <w:t>SRC034</w:t>
+            </w:r>
+          </w:p>
+        </w:tc>
+        <w:tc>
+          <w:tcPr>
+            <w:tcW w:type="dxa" w:w="1399"/>
+          </w:tcPr>
+          <w:p>
+            <w:r>
+              <w:t>45</w:t>
+            </w:r>
+          </w:p>
+        </w:tc>
+      </w:tr>
+      <w:tr>
+        <w:tc>
+          <w:tcPr>
+            <w:tcW w:type="dxa" w:w="1399"/>
+          </w:tcPr>
+          <w:p>
+            <w:r>
+              <w:t>Dr. Jamilu Isyaku Gwamna</w:t>
+            </w:r>
+          </w:p>
+        </w:tc>
+        <w:tc>
+          <w:tcPr>
+            <w:tcW w:type="dxa" w:w="1399"/>
+          </w:tcPr>
+          <w:p>
+            <w:r>
+              <w:t>Major leadership roles</w:t>
+            </w:r>
+          </w:p>
+        </w:tc>
+        <w:tc>
+          <w:tcPr>
+            <w:tcW w:type="dxa" w:w="1399"/>
+          </w:tcPr>
+          <w:p>
+            <w:r>
+              <w:t>2016-2022</w:t>
+            </w:r>
+          </w:p>
+        </w:tc>
+        <w:tc>
+          <w:tcPr>
+            <w:tcW w:type="dxa" w:w="1399"/>
+          </w:tcPr>
+          <w:p>
+            <w:r>
+              <w:t>Managing Director / Chief Executive Officer</w:t>
+            </w:r>
+          </w:p>
+        </w:tc>
+        <w:tc>
+          <w:tcPr>
+            <w:tcW w:type="dxa" w:w="1399"/>
+          </w:tcPr>
+          <w:p>
+            <w:r>
+              <w:t>Kano Electricity Distribution Company</w:t>
+            </w:r>
+          </w:p>
+        </w:tc>
+        <w:tc>
+          <w:tcPr>
+            <w:tcW w:type="dxa" w:w="1399"/>
+          </w:tcPr>
+          <w:p>
+            <w:r>
+              <w:t>SRC006</w:t>
+            </w:r>
+          </w:p>
+        </w:tc>
+        <w:tc>
+          <w:tcPr>
+            <w:tcW w:type="dxa" w:w="1399"/>
+          </w:tcPr>
+          <w:p>
+            <w:r>
+              <w:t>72</w:t>
+            </w:r>
+          </w:p>
+        </w:tc>
+      </w:tr>
+      <w:tr>
+        <w:tc>
+          <w:tcPr>
+            <w:tcW w:type="dxa" w:w="1399"/>
+          </w:tcPr>
+          <w:p>
+            <w:r>
+              <w:t>Dr. Jamilu Isyaku Gwamna</w:t>
+            </w:r>
+          </w:p>
+        </w:tc>
+        <w:tc>
+          <w:tcPr>
+            <w:tcW w:type="dxa" w:w="1399"/>
+          </w:tcPr>
+          <w:p>
+            <w:r>
+              <w:t>Political leadership</w:t>
+            </w:r>
+          </w:p>
+        </w:tc>
+        <w:tc>
+          <w:tcPr>
+            <w:tcW w:type="dxa" w:w="1399"/>
+          </w:tcPr>
+          <w:p>
+            <w:r>
+              <w:t>2019</w:t>
+            </w:r>
+          </w:p>
+        </w:tc>
+        <w:tc>
+          <w:tcPr>
+            <w:tcW w:type="dxa" w:w="1399"/>
+          </w:tcPr>
+          <w:p>
+            <w:r>
+              <w:t>APC political figure in Gombe State</w:t>
+            </w:r>
+          </w:p>
+        </w:tc>
+        <w:tc>
+          <w:tcPr>
+            <w:tcW w:type="dxa" w:w="1399"/>
+          </w:tcPr>
+          <w:p>
+            <w:r>
+              <w:t>All Progressives Congress, Gombe State</w:t>
+            </w:r>
+          </w:p>
+        </w:tc>
+        <w:tc>
+          <w:tcPr>
+            <w:tcW w:type="dxa" w:w="1399"/>
+          </w:tcPr>
+          <w:p>
+            <w:r>
+              <w:t>SRC031</w:t>
+            </w:r>
+          </w:p>
+        </w:tc>
+        <w:tc>
+          <w:tcPr>
+            <w:tcW w:type="dxa" w:w="1399"/>
+          </w:tcPr>
+          <w:p>
+            <w:r>
+              <w:t>35</w:t>
+            </w:r>
+          </w:p>
+        </w:tc>
+      </w:tr>
+      <w:tr>
+        <w:tc>
+          <w:tcPr>
+            <w:tcW w:type="dxa" w:w="1399"/>
+          </w:tcPr>
+          <w:p>
+            <w:r>
+              <w:t>Dr. Jamilu Isyaku Gwamna</w:t>
+            </w:r>
+          </w:p>
+        </w:tc>
+        <w:tc>
+          <w:tcPr>
+            <w:tcW w:type="dxa" w:w="1399"/>
+          </w:tcPr>
+          <w:p>
+            <w:r>
+              <w:t>Major achievements</w:t>
+            </w:r>
+          </w:p>
+        </w:tc>
+        <w:tc>
+          <w:tcPr>
+            <w:tcW w:type="dxa" w:w="1399"/>
+          </w:tcPr>
+          <w:p>
+            <w:r>
+              <w:t>2016</w:t>
+            </w:r>
+          </w:p>
+        </w:tc>
+        <w:tc>
+          <w:tcPr>
+            <w:tcW w:type="dxa" w:w="1399"/>
+          </w:tcPr>
+          <w:p>
+            <w:r>
+              <w:t>Customer fault-resolution and service-responsiveness pledge</w:t>
+            </w:r>
+          </w:p>
+        </w:tc>
+        <w:tc>
+          <w:tcPr>
+            <w:tcW w:type="dxa" w:w="1399"/>
+          </w:tcPr>
+          <w:p>
+            <w:r>
+              <w:t>Kano Electricity Distribution Company</w:t>
+            </w:r>
+          </w:p>
+        </w:tc>
+        <w:tc>
+          <w:tcPr>
+            <w:tcW w:type="dxa" w:w="1399"/>
+          </w:tcPr>
+          <w:p>
+            <w:r>
+              <w:t>SRC028</w:t>
+            </w:r>
+          </w:p>
+        </w:tc>
+        <w:tc>
+          <w:tcPr>
+            <w:tcW w:type="dxa" w:w="1399"/>
+          </w:tcPr>
+          <w:p>
+            <w:r>
+              <w:t>55</w:t>
+            </w:r>
+          </w:p>
+        </w:tc>
+      </w:tr>
+      <w:tr>
+        <w:tc>
+          <w:tcPr>
+            <w:tcW w:type="dxa" w:w="1399"/>
+          </w:tcPr>
+          <w:p>
+            <w:r>
+              <w:t>Dr. Jamilu Isyaku Gwamna</w:t>
+            </w:r>
+          </w:p>
+        </w:tc>
+        <w:tc>
+          <w:tcPr>
+            <w:tcW w:type="dxa" w:w="1399"/>
+          </w:tcPr>
+          <w:p>
+            <w:r>
+              <w:t>Major achievements</w:t>
+            </w:r>
+          </w:p>
+        </w:tc>
+        <w:tc>
+          <w:tcPr>
+            <w:tcW w:type="dxa" w:w="1399"/>
+          </w:tcPr>
+          <w:p>
+            <w:r>
+              <w:t>2019</w:t>
+            </w:r>
+          </w:p>
+        </w:tc>
+        <w:tc>
+          <w:tcPr>
+            <w:tcW w:type="dxa" w:w="1399"/>
+          </w:tcPr>
+          <w:p>
+            <w:r>
+              <w:t>Power distribution and industrialization vision</w:t>
+            </w:r>
+          </w:p>
+        </w:tc>
+        <w:tc>
+          <w:tcPr>
+            <w:tcW w:type="dxa" w:w="1399"/>
+          </w:tcPr>
+          <w:p>
+            <w:r>
+              <w:t>Kano Electricity Distribution Company</w:t>
+            </w:r>
+          </w:p>
+        </w:tc>
+        <w:tc>
+          <w:tcPr>
+            <w:tcW w:type="dxa" w:w="1399"/>
+          </w:tcPr>
+          <w:p>
+            <w:r>
+              <w:t>SRC029</w:t>
+            </w:r>
+          </w:p>
+        </w:tc>
+        <w:tc>
+          <w:tcPr>
+            <w:tcW w:type="dxa" w:w="1399"/>
+          </w:tcPr>
+          <w:p>
+            <w:r>
+              <w:t>58</w:t>
+            </w:r>
+          </w:p>
+        </w:tc>
+      </w:tr>
+      <w:tr>
+        <w:tc>
+          <w:tcPr>
+            <w:tcW w:type="dxa" w:w="1399"/>
+          </w:tcPr>
+          <w:p>
+            <w:r>
+              <w:t>Dr. Jamilu Isyaku Gwamna</w:t>
+            </w:r>
+          </w:p>
+        </w:tc>
+        <w:tc>
+          <w:tcPr>
+            <w:tcW w:type="dxa" w:w="1399"/>
+          </w:tcPr>
+          <w:p>
+            <w:r>
+              <w:t>Major achievements</w:t>
+            </w:r>
+          </w:p>
+        </w:tc>
+        <w:tc>
+          <w:tcPr>
+            <w:tcW w:type="dxa" w:w="1399"/>
+          </w:tcPr>
+          <w:p>
+            <w:r>
+              <w:t>2020</w:t>
+            </w:r>
+          </w:p>
+        </w:tc>
+        <w:tc>
+          <w:tcPr>
+            <w:tcW w:type="dxa" w:w="1399"/>
+          </w:tcPr>
+          <w:p>
+            <w:r>
+              <w:t>COVID-era service continuity and safety strategy</w:t>
+            </w:r>
+          </w:p>
+        </w:tc>
+        <w:tc>
+          <w:tcPr>
+            <w:tcW w:type="dxa" w:w="1399"/>
+          </w:tcPr>
+          <w:p>
+            <w:r>
+              <w:t>Kano Electricity Distribution Company</w:t>
+            </w:r>
+          </w:p>
+        </w:tc>
+        <w:tc>
+          <w:tcPr>
+            <w:tcW w:type="dxa" w:w="1399"/>
+          </w:tcPr>
+          <w:p>
+            <w:r>
+              <w:t>SRC006</w:t>
+            </w:r>
+          </w:p>
+        </w:tc>
+        <w:tc>
+          <w:tcPr>
+            <w:tcW w:type="dxa" w:w="1399"/>
+          </w:tcPr>
+          <w:p>
+            <w:r>
+              <w:t>60</w:t>
+            </w:r>
+          </w:p>
+        </w:tc>
+      </w:tr>
+      <w:tr>
+        <w:tc>
+          <w:tcPr>
+            <w:tcW w:type="dxa" w:w="1399"/>
+          </w:tcPr>
+          <w:p>
+            <w:r>
+              <w:t>Dr. Jamilu Isyaku Gwamna</w:t>
+            </w:r>
+          </w:p>
+        </w:tc>
+        <w:tc>
+          <w:tcPr>
+            <w:tcW w:type="dxa" w:w="1399"/>
+          </w:tcPr>
+          <w:p>
+            <w:r>
+              <w:t>Community service</w:t>
+            </w:r>
+          </w:p>
+        </w:tc>
+        <w:tc>
+          <w:tcPr>
+            <w:tcW w:type="dxa" w:w="1399"/>
+          </w:tcPr>
+          <w:p>
+            <w:r>
+              <w:t>2020</w:t>
+            </w:r>
+          </w:p>
+        </w:tc>
+        <w:tc>
+          <w:tcPr>
+            <w:tcW w:type="dxa" w:w="1399"/>
+          </w:tcPr>
+          <w:p>
+            <w:r>
+              <w:t>Scholarship support for Gombe students studying in Morocco</w:t>
+            </w:r>
+          </w:p>
+        </w:tc>
+        <w:tc>
+          <w:tcPr>
+            <w:tcW w:type="dxa" w:w="1399"/>
+          </w:tcPr>
+          <w:p>
+            <w:r>
+              <w:t>Community philanthropy</w:t>
+            </w:r>
+          </w:p>
+        </w:tc>
+        <w:tc>
+          <w:tcPr>
+            <w:tcW w:type="dxa" w:w="1399"/>
+          </w:tcPr>
+          <w:p>
+            <w:r>
+              <w:t>SRC030</w:t>
+            </w:r>
+          </w:p>
+        </w:tc>
+        <w:tc>
+          <w:tcPr>
+            <w:tcW w:type="dxa" w:w="1399"/>
+          </w:tcPr>
+          <w:p>
+            <w:r>
+              <w:t>68</w:t>
+            </w:r>
+          </w:p>
+        </w:tc>
+      </w:tr>
+      <w:tr>
+        <w:tc>
+          <w:tcPr>
+            <w:tcW w:type="dxa" w:w="1399"/>
+          </w:tcPr>
+          <w:p>
+            <w:r>
+              <w:t>Dr. Jamilu Isyaku Gwamna</w:t>
+            </w:r>
+          </w:p>
+        </w:tc>
+        <w:tc>
+          <w:tcPr>
+            <w:tcW w:type="dxa" w:w="1399"/>
+          </w:tcPr>
+          <w:p>
+            <w:r>
+              <w:t>Major achievements</w:t>
+            </w:r>
+          </w:p>
+        </w:tc>
+        <w:tc>
+          <w:tcPr>
+            <w:tcW w:type="dxa" w:w="1399"/>
+          </w:tcPr>
+          <w:p>
+            <w:r>
+              <w:t>2022</w:t>
+            </w:r>
+          </w:p>
+        </w:tc>
+        <w:tc>
+          <w:tcPr>
+            <w:tcW w:type="dxa" w:w="1399"/>
+          </w:tcPr>
+          <w:p>
+            <w:r>
+              <w:t>Transformer, accessories and feeder construction activity</w:t>
+            </w:r>
+          </w:p>
+        </w:tc>
+        <w:tc>
+          <w:tcPr>
+            <w:tcW w:type="dxa" w:w="1399"/>
+          </w:tcPr>
+          <w:p>
+            <w:r>
+              <w:t>Kano Electricity Distribution Company</w:t>
+            </w:r>
+          </w:p>
+        </w:tc>
+        <w:tc>
+          <w:tcPr>
+            <w:tcW w:type="dxa" w:w="1399"/>
+          </w:tcPr>
+          <w:p>
+            <w:r>
+              <w:t>SRC008</w:t>
+            </w:r>
+          </w:p>
+        </w:tc>
+        <w:tc>
+          <w:tcPr>
+            <w:tcW w:type="dxa" w:w="1399"/>
+          </w:tcPr>
+          <w:p>
+            <w:r>
+              <w:t>68</w:t>
+            </w:r>
+          </w:p>
+        </w:tc>
+      </w:tr>
+      <w:tr>
+        <w:tc>
+          <w:tcPr>
+            <w:tcW w:type="dxa" w:w="1399"/>
+          </w:tcPr>
+          <w:p>
+            <w:r>
+              <w:t>Dr. Jamilu Isyaku Gwamna</w:t>
+            </w:r>
+          </w:p>
+        </w:tc>
+        <w:tc>
+          <w:tcPr>
+            <w:tcW w:type="dxa" w:w="1399"/>
+          </w:tcPr>
+          <w:p>
+            <w:r>
+              <w:t>Public impact</w:t>
+            </w:r>
+          </w:p>
+        </w:tc>
+        <w:tc>
+          <w:tcPr>
+            <w:tcW w:type="dxa" w:w="1399"/>
+          </w:tcPr>
+          <w:p>
+            <w:r>
+              <w:t>2022</w:t>
+            </w:r>
+          </w:p>
+        </w:tc>
+        <w:tc>
+          <w:tcPr>
+            <w:tcW w:type="dxa" w:w="1399"/>
+          </w:tcPr>
+          <w:p>
+            <w:r>
+              <w:t>Kano DisCo metering rate benchmark</w:t>
+            </w:r>
+          </w:p>
+        </w:tc>
+        <w:tc>
+          <w:tcPr>
+            <w:tcW w:type="dxa" w:w="1399"/>
+          </w:tcPr>
+          <w:p>
+            <w:r>
+              <w:t>Nigerian Electricity Regulatory Commission / Kano DisCo</w:t>
+            </w:r>
+          </w:p>
+        </w:tc>
+        <w:tc>
+          <w:tcPr>
+            <w:tcW w:type="dxa" w:w="1399"/>
+          </w:tcPr>
+          <w:p>
+            <w:r>
+              <w:t>SRC004</w:t>
+            </w:r>
+          </w:p>
+        </w:tc>
+        <w:tc>
+          <w:tcPr>
+            <w:tcW w:type="dxa" w:w="1399"/>
+          </w:tcPr>
+          <w:p>
+            <w:r>
+              <w:t>70</w:t>
+            </w:r>
+          </w:p>
+        </w:tc>
+      </w:tr>
+      <w:tr>
+        <w:tc>
+          <w:tcPr>
+            <w:tcW w:type="dxa" w:w="1399"/>
+          </w:tcPr>
+          <w:p>
+            <w:r>
+              <w:t>Dr. Jamilu Isyaku Gwamna</w:t>
+            </w:r>
+          </w:p>
+        </w:tc>
+        <w:tc>
+          <w:tcPr>
+            <w:tcW w:type="dxa" w:w="1399"/>
+          </w:tcPr>
+          <w:p>
+            <w:r>
+              <w:t>Criticisms and limitations</w:t>
+            </w:r>
+          </w:p>
+        </w:tc>
+        <w:tc>
+          <w:tcPr>
+            <w:tcW w:type="dxa" w:w="1399"/>
+          </w:tcPr>
+          <w:p>
+            <w:r>
+              <w:t>2022</w:t>
+            </w:r>
+          </w:p>
+        </w:tc>
+        <w:tc>
+          <w:tcPr>
+            <w:tcW w:type="dxa" w:w="1399"/>
+          </w:tcPr>
+          <w:p>
+            <w:r>
+              <w:t>Utility-sector performance limitations and complaint context</w:t>
+            </w:r>
+          </w:p>
+        </w:tc>
+        <w:tc>
+          <w:tcPr>
+            <w:tcW w:type="dxa" w:w="1399"/>
+          </w:tcPr>
+          <w:p>
+            <w:r>
+              <w:t>Kano DisCo / Nigerian electricity distribution sector</w:t>
+            </w:r>
+          </w:p>
+        </w:tc>
+        <w:tc>
+          <w:tcPr>
+            <w:tcW w:type="dxa" w:w="1399"/>
+          </w:tcPr>
+          <w:p>
+            <w:r>
+              <w:t>SRC005</w:t>
+            </w:r>
+          </w:p>
+        </w:tc>
+        <w:tc>
+          <w:tcPr>
+            <w:tcW w:type="dxa" w:w="1399"/>
+          </w:tcPr>
+          <w:p>
+            <w:r>
+              <w:t>0</w:t>
+            </w:r>
+          </w:p>
+        </w:tc>
+      </w:tr>
+      <w:tr>
+        <w:tc>
+          <w:tcPr>
+            <w:tcW w:type="dxa" w:w="1399"/>
+          </w:tcPr>
+          <w:p>
+            <w:r>
+              <w:t>Dr. Jamilu Isyaku Gwamna</w:t>
+            </w:r>
+          </w:p>
+        </w:tc>
+        <w:tc>
+          <w:tcPr>
+            <w:tcW w:type="dxa" w:w="1399"/>
+          </w:tcPr>
+          <w:p>
+            <w:r>
+              <w:t>Current relevance</w:t>
+            </w:r>
+          </w:p>
+        </w:tc>
+        <w:tc>
+          <w:tcPr>
+            <w:tcW w:type="dxa" w:w="1399"/>
+          </w:tcPr>
+          <w:p>
+            <w:r>
+              <w:t>2024-2026</w:t>
+            </w:r>
+          </w:p>
+        </w:tc>
+        <w:tc>
+          <w:tcPr>
+            <w:tcW w:type="dxa" w:w="1399"/>
+          </w:tcPr>
+          <w:p>
+            <w:r>
+              <w:t>Public figure associated with utility leadership and Gombe civic philanthropy</w:t>
+            </w:r>
+          </w:p>
+        </w:tc>
+        <w:tc>
+          <w:tcPr>
+            <w:tcW w:type="dxa" w:w="1399"/>
+          </w:tcPr>
+          <w:p>
+            <w:r>
+              <w:t>KEDCO / Gombe civic space</w:t>
+            </w:r>
+          </w:p>
+        </w:tc>
+        <w:tc>
+          <w:tcPr>
+            <w:tcW w:type="dxa" w:w="1399"/>
+          </w:tcPr>
+          <w:p>
+            <w:r>
+              <w:t>SRC007</w:t>
+            </w:r>
+          </w:p>
+        </w:tc>
+        <w:tc>
+          <w:tcPr>
+            <w:tcW w:type="dxa" w:w="1399"/>
+          </w:tcPr>
+          <w:p>
+            <w:r>
+              <w:t>45</w:t>
+            </w:r>
+          </w:p>
+        </w:tc>
+      </w:tr>
+      <w:tr>
+        <w:tc>
+          <w:tcPr>
+            <w:tcW w:type="dxa" w:w="1399"/>
+          </w:tcPr>
+          <w:p>
+            <w:r>
+              <w:t>Hon. Saidu Ahmed Alkali</w:t>
+            </w:r>
+          </w:p>
+        </w:tc>
+        <w:tc>
+          <w:tcPr>
+            <w:tcW w:type="dxa" w:w="1399"/>
+          </w:tcPr>
+          <w:p>
+            <w:r>
+              <w:t>Early background</w:t>
+            </w:r>
+          </w:p>
+        </w:tc>
+        <w:tc>
+          <w:tcPr>
+            <w:tcW w:type="dxa" w:w="1399"/>
+          </w:tcPr>
+          <w:p>
+            <w:r>
+              <w:t>1969</w:t>
+            </w:r>
+          </w:p>
+        </w:tc>
+        <w:tc>
+          <w:tcPr>
+            <w:tcW w:type="dxa" w:w="1399"/>
+          </w:tcPr>
+          <w:p>
+            <w:r>
+              <w:t>Born in Gombe State, Nigeria</w:t>
+            </w:r>
+          </w:p>
+        </w:tc>
+        <w:tc>
+          <w:tcPr>
+            <w:tcW w:type="dxa" w:w="1399"/>
+          </w:tcPr>
+          <w:p>
+            <w:r>
+              <w:t>Gombe State</w:t>
+            </w:r>
+          </w:p>
+        </w:tc>
+        <w:tc>
+          <w:tcPr>
+            <w:tcW w:type="dxa" w:w="1399"/>
+          </w:tcPr>
+          <w:p>
+            <w:r>
+              <w:t>SRC013</w:t>
+            </w:r>
+          </w:p>
+        </w:tc>
+        <w:tc>
+          <w:tcPr>
+            <w:tcW w:type="dxa" w:w="1399"/>
+          </w:tcPr>
+          <w:p>
+            <w:r>
+              <w:t>20</w:t>
+            </w:r>
+          </w:p>
+        </w:tc>
+      </w:tr>
+      <w:tr>
+        <w:tc>
+          <w:tcPr>
+            <w:tcW w:type="dxa" w:w="1399"/>
+          </w:tcPr>
+          <w:p>
+            <w:r>
+              <w:t>Hon. Saidu Ahmed Alkali</w:t>
+            </w:r>
+          </w:p>
+        </w:tc>
+        <w:tc>
+          <w:tcPr>
+            <w:tcW w:type="dxa" w:w="1399"/>
+          </w:tcPr>
+          <w:p>
+            <w:r>
+              <w:t>Early background</w:t>
+            </w:r>
+          </w:p>
+        </w:tc>
+        <w:tc>
+          <w:tcPr>
+            <w:tcW w:type="dxa" w:w="1399"/>
+          </w:tcPr>
+          <w:p>
+            <w:r>
+              <w:t>Family background publicly reported</w:t>
+            </w:r>
+          </w:p>
+        </w:tc>
+        <w:tc>
+          <w:tcPr>
+            <w:tcW w:type="dxa" w:w="1399"/>
+          </w:tcPr>
+          <w:p>
+            <w:r>
+              <w:t>Parent identified in secondary public records</w:t>
+            </w:r>
+          </w:p>
+        </w:tc>
+        <w:tc>
+          <w:tcPr>
+            <w:tcW w:type="dxa" w:w="1399"/>
+          </w:tcPr>
+          <w:p>
+            <w:r>
+              <w:t>Gombe State</w:t>
+            </w:r>
+          </w:p>
+        </w:tc>
+        <w:tc>
+          <w:tcPr>
+            <w:tcW w:type="dxa" w:w="1399"/>
+          </w:tcPr>
+          <w:p>
+            <w:r>
+              <w:t>SRC012</w:t>
+            </w:r>
+          </w:p>
+        </w:tc>
+        <w:tc>
+          <w:tcPr>
+            <w:tcW w:type="dxa" w:w="1399"/>
+          </w:tcPr>
+          <w:p>
+            <w:r>
+              <w:t>12</w:t>
+            </w:r>
+          </w:p>
+        </w:tc>
+      </w:tr>
+      <w:tr>
+        <w:tc>
+          <w:tcPr>
+            <w:tcW w:type="dxa" w:w="1399"/>
+          </w:tcPr>
+          <w:p>
+            <w:r>
+              <w:t>Hon. Saidu Ahmed Alkali</w:t>
+            </w:r>
+          </w:p>
+        </w:tc>
+        <w:tc>
+          <w:tcPr>
+            <w:tcW w:type="dxa" w:w="1399"/>
+          </w:tcPr>
+          <w:p>
+            <w:r>
+              <w:t>Education</w:t>
+            </w:r>
+          </w:p>
+        </w:tc>
+        <w:tc>
+          <w:tcPr>
+            <w:tcW w:type="dxa" w:w="1399"/>
+          </w:tcPr>
+          <w:p>
+            <w:r>
+              <w:t>Early schooling period</w:t>
+            </w:r>
+          </w:p>
+        </w:tc>
+        <w:tc>
+          <w:tcPr>
+            <w:tcW w:type="dxa" w:w="1399"/>
+          </w:tcPr>
+          <w:p>
+            <w:r>
+              <w:t>Community schooling reported</w:t>
+            </w:r>
+          </w:p>
+        </w:tc>
+        <w:tc>
+          <w:tcPr>
+            <w:tcW w:type="dxa" w:w="1399"/>
+          </w:tcPr>
+          <w:p>
+            <w:r>
+              <w:t>Gombe community schools</w:t>
+            </w:r>
+          </w:p>
+        </w:tc>
+        <w:tc>
+          <w:tcPr>
+            <w:tcW w:type="dxa" w:w="1399"/>
+          </w:tcPr>
+          <w:p>
+            <w:r>
+              <w:t>SRC033</w:t>
+            </w:r>
+          </w:p>
+        </w:tc>
+        <w:tc>
+          <w:tcPr>
+            <w:tcW w:type="dxa" w:w="1399"/>
+          </w:tcPr>
+          <w:p>
+            <w:r>
+              <w:t>28</w:t>
+            </w:r>
+          </w:p>
+        </w:tc>
+      </w:tr>
+      <w:tr>
+        <w:tc>
+          <w:tcPr>
+            <w:tcW w:type="dxa" w:w="1399"/>
+          </w:tcPr>
+          <w:p>
+            <w:r>
+              <w:t>Hon. Saidu Ahmed Alkali</w:t>
+            </w:r>
+          </w:p>
+        </w:tc>
+        <w:tc>
+          <w:tcPr>
+            <w:tcW w:type="dxa" w:w="1399"/>
+          </w:tcPr>
+          <w:p>
+            <w:r>
+              <w:t>Education</w:t>
+            </w:r>
+          </w:p>
+        </w:tc>
+        <w:tc>
+          <w:tcPr>
+            <w:tcW w:type="dxa" w:w="1399"/>
+          </w:tcPr>
+          <w:p>
+            <w:r>
+              <w:t>Period not specified</w:t>
+            </w:r>
+          </w:p>
+        </w:tc>
+        <w:tc>
+          <w:tcPr>
+            <w:tcW w:type="dxa" w:w="1399"/>
+          </w:tcPr>
+          <w:p>
+            <w:r>
+              <w:t>Economics degree reported</w:t>
+            </w:r>
+          </w:p>
+        </w:tc>
+        <w:tc>
+          <w:tcPr>
+            <w:tcW w:type="dxa" w:w="1399"/>
+          </w:tcPr>
+          <w:p>
+            <w:r>
+              <w:t>University of Maiduguri</w:t>
+            </w:r>
+          </w:p>
+        </w:tc>
+        <w:tc>
+          <w:tcPr>
+            <w:tcW w:type="dxa" w:w="1399"/>
+          </w:tcPr>
+          <w:p>
+            <w:r>
+              <w:t>SRC033</w:t>
+            </w:r>
+          </w:p>
+        </w:tc>
+        <w:tc>
+          <w:tcPr>
+            <w:tcW w:type="dxa" w:w="1399"/>
+          </w:tcPr>
+          <w:p>
+            <w:r>
+              <w:t>42</w:t>
+            </w:r>
+          </w:p>
+        </w:tc>
+      </w:tr>
+      <w:tr>
+        <w:tc>
+          <w:tcPr>
+            <w:tcW w:type="dxa" w:w="1399"/>
+          </w:tcPr>
+          <w:p>
+            <w:r>
+              <w:t>Hon. Saidu Ahmed Alkali</w:t>
+            </w:r>
+          </w:p>
+        </w:tc>
+        <w:tc>
+          <w:tcPr>
+            <w:tcW w:type="dxa" w:w="1399"/>
+          </w:tcPr>
+          <w:p>
+            <w:r>
+              <w:t>Early career</w:t>
+            </w:r>
+          </w:p>
+        </w:tc>
+        <w:tc>
+          <w:tcPr>
+            <w:tcW w:type="dxa" w:w="1399"/>
+          </w:tcPr>
+          <w:p>
+            <w:r>
+              <w:t>Before 2010</w:t>
+            </w:r>
+          </w:p>
+        </w:tc>
+        <w:tc>
+          <w:tcPr>
+            <w:tcW w:type="dxa" w:w="1399"/>
+          </w:tcPr>
+          <w:p>
+            <w:r>
+              <w:t>Secretary</w:t>
+            </w:r>
+          </w:p>
+        </w:tc>
+        <w:tc>
+          <w:tcPr>
+            <w:tcW w:type="dxa" w:w="1399"/>
+          </w:tcPr>
+          <w:p>
+            <w:r>
+              <w:t>Muslim Pilgrims Welfare Board, Gombe State</w:t>
+            </w:r>
+          </w:p>
+        </w:tc>
+        <w:tc>
+          <w:tcPr>
+            <w:tcW w:type="dxa" w:w="1399"/>
+          </w:tcPr>
+          <w:p>
+            <w:r>
+              <w:t>SRC013</w:t>
+            </w:r>
+          </w:p>
+        </w:tc>
+        <w:tc>
+          <w:tcPr>
+            <w:tcW w:type="dxa" w:w="1399"/>
+          </w:tcPr>
+          <w:p>
+            <w:r>
+              <w:t>55</w:t>
+            </w:r>
+          </w:p>
+        </w:tc>
+      </w:tr>
+      <w:tr>
+        <w:tc>
+          <w:tcPr>
+            <w:tcW w:type="dxa" w:w="1399"/>
+          </w:tcPr>
+          <w:p>
+            <w:r>
+              <w:t>Hon. Saidu Ahmed Alkali</w:t>
+            </w:r>
+          </w:p>
+        </w:tc>
+        <w:tc>
+          <w:tcPr>
+            <w:tcW w:type="dxa" w:w="1399"/>
+          </w:tcPr>
+          <w:p>
+            <w:r>
+              <w:t>Professional growth</w:t>
+            </w:r>
+          </w:p>
+        </w:tc>
+        <w:tc>
+          <w:tcPr>
+            <w:tcW w:type="dxa" w:w="1399"/>
+          </w:tcPr>
+          <w:p>
+            <w:r>
+              <w:t>Before 2010</w:t>
+            </w:r>
+          </w:p>
+        </w:tc>
+        <w:tc>
+          <w:tcPr>
+            <w:tcW w:type="dxa" w:w="1399"/>
+          </w:tcPr>
+          <w:p>
+            <w:r>
+              <w:t>Commissioner of Information</w:t>
+            </w:r>
+          </w:p>
+        </w:tc>
+        <w:tc>
+          <w:tcPr>
+            <w:tcW w:type="dxa" w:w="1399"/>
+          </w:tcPr>
+          <w:p>
+            <w:r>
+              <w:t>Gombe State Executive Council</w:t>
+            </w:r>
+          </w:p>
+        </w:tc>
+        <w:tc>
+          <w:tcPr>
+            <w:tcW w:type="dxa" w:w="1399"/>
+          </w:tcPr>
+          <w:p>
+            <w:r>
+              <w:t>SRC013</w:t>
+            </w:r>
+          </w:p>
+        </w:tc>
+        <w:tc>
+          <w:tcPr>
+            <w:tcW w:type="dxa" w:w="1399"/>
+          </w:tcPr>
+          <w:p>
+            <w:r>
+              <w:t>62</w:t>
+            </w:r>
+          </w:p>
+        </w:tc>
+      </w:tr>
+      <w:tr>
+        <w:tc>
+          <w:tcPr>
+            <w:tcW w:type="dxa" w:w="1399"/>
+          </w:tcPr>
+          <w:p>
+            <w:r>
+              <w:t>Hon. Saidu Ahmed Alkali</w:t>
+            </w:r>
+          </w:p>
+        </w:tc>
+        <w:tc>
+          <w:tcPr>
+            <w:tcW w:type="dxa" w:w="1399"/>
+          </w:tcPr>
+          <w:p>
+            <w:r>
+              <w:t>Major leadership roles</w:t>
+            </w:r>
+          </w:p>
+        </w:tc>
+        <w:tc>
+          <w:tcPr>
+            <w:tcW w:type="dxa" w:w="1399"/>
+          </w:tcPr>
+          <w:p>
+            <w:r>
+              <w:t>2010-2011</w:t>
+            </w:r>
+          </w:p>
+        </w:tc>
+        <w:tc>
+          <w:tcPr>
+            <w:tcW w:type="dxa" w:w="1399"/>
+          </w:tcPr>
+          <w:p>
+            <w:r>
+              <w:t>Senator for Gombe North after by-election</w:t>
+            </w:r>
+          </w:p>
+        </w:tc>
+        <w:tc>
+          <w:tcPr>
+            <w:tcW w:type="dxa" w:w="1399"/>
+          </w:tcPr>
+          <w:p>
+            <w:r>
+              <w:t>National Assembly</w:t>
+            </w:r>
+          </w:p>
+        </w:tc>
+        <w:tc>
+          <w:tcPr>
+            <w:tcW w:type="dxa" w:w="1399"/>
+          </w:tcPr>
+          <w:p>
+            <w:r>
+              <w:t>SRC013</w:t>
+            </w:r>
+          </w:p>
+        </w:tc>
+        <w:tc>
+          <w:tcPr>
+            <w:tcW w:type="dxa" w:w="1399"/>
+          </w:tcPr>
+          <w:p>
+            <w:r>
+              <w:t>60</w:t>
+            </w:r>
+          </w:p>
+        </w:tc>
+      </w:tr>
+      <w:tr>
+        <w:tc>
+          <w:tcPr>
+            <w:tcW w:type="dxa" w:w="1399"/>
+          </w:tcPr>
+          <w:p>
+            <w:r>
+              <w:t>Hon. Saidu Ahmed Alkali</w:t>
+            </w:r>
+          </w:p>
+        </w:tc>
+        <w:tc>
+          <w:tcPr>
+            <w:tcW w:type="dxa" w:w="1399"/>
+          </w:tcPr>
+          <w:p>
+            <w:r>
+              <w:t>Major leadership roles</w:t>
+            </w:r>
+          </w:p>
+        </w:tc>
+        <w:tc>
+          <w:tcPr>
+            <w:tcW w:type="dxa" w:w="1399"/>
+          </w:tcPr>
+          <w:p>
+            <w:r>
+              <w:t>2011-2015</w:t>
+            </w:r>
+          </w:p>
+        </w:tc>
+        <w:tc>
+          <w:tcPr>
+            <w:tcW w:type="dxa" w:w="1399"/>
+          </w:tcPr>
+          <w:p>
+            <w:r>
+              <w:t>Re-elected Senator for Gombe North</w:t>
+            </w:r>
+          </w:p>
+        </w:tc>
+        <w:tc>
+          <w:tcPr>
+            <w:tcW w:type="dxa" w:w="1399"/>
+          </w:tcPr>
+          <w:p>
+            <w:r>
+              <w:t>National Assembly</w:t>
+            </w:r>
+          </w:p>
+        </w:tc>
+        <w:tc>
+          <w:tcPr>
+            <w:tcW w:type="dxa" w:w="1399"/>
+          </w:tcPr>
+          <w:p>
+            <w:r>
+              <w:t>SRC013</w:t>
+            </w:r>
+          </w:p>
+        </w:tc>
+        <w:tc>
+          <w:tcPr>
+            <w:tcW w:type="dxa" w:w="1399"/>
+          </w:tcPr>
+          <w:p>
+            <w:r>
+              <w:t>62</w:t>
+            </w:r>
+          </w:p>
+        </w:tc>
+      </w:tr>
+      <w:tr>
+        <w:tc>
+          <w:tcPr>
+            <w:tcW w:type="dxa" w:w="1399"/>
+          </w:tcPr>
+          <w:p>
+            <w:r>
+              <w:t>Hon. Saidu Ahmed Alkali</w:t>
+            </w:r>
+          </w:p>
+        </w:tc>
+        <w:tc>
+          <w:tcPr>
+            <w:tcW w:type="dxa" w:w="1399"/>
+          </w:tcPr>
+          <w:p>
+            <w:r>
+              <w:t>Major leadership roles</w:t>
+            </w:r>
+          </w:p>
+        </w:tc>
+        <w:tc>
+          <w:tcPr>
+            <w:tcW w:type="dxa" w:w="1399"/>
+          </w:tcPr>
+          <w:p>
+            <w:r>
+              <w:t>2019-2023</w:t>
+            </w:r>
+          </w:p>
+        </w:tc>
+        <w:tc>
+          <w:tcPr>
+            <w:tcW w:type="dxa" w:w="1399"/>
+          </w:tcPr>
+          <w:p>
+            <w:r>
+              <w:t>Senator for Gombe North under APC</w:t>
+            </w:r>
+          </w:p>
+        </w:tc>
+        <w:tc>
+          <w:tcPr>
+            <w:tcW w:type="dxa" w:w="1399"/>
+          </w:tcPr>
+          <w:p>
+            <w:r>
+              <w:t>National Assembly</w:t>
+            </w:r>
+          </w:p>
+        </w:tc>
+        <w:tc>
+          <w:tcPr>
+            <w:tcW w:type="dxa" w:w="1399"/>
+          </w:tcPr>
+          <w:p>
+            <w:r>
+              <w:t>SRC013</w:t>
+            </w:r>
+          </w:p>
+        </w:tc>
+        <w:tc>
+          <w:tcPr>
+            <w:tcW w:type="dxa" w:w="1399"/>
+          </w:tcPr>
+          <w:p>
+            <w:r>
+              <w:t>62</w:t>
+            </w:r>
+          </w:p>
+        </w:tc>
+      </w:tr>
+      <w:tr>
+        <w:tc>
+          <w:tcPr>
+            <w:tcW w:type="dxa" w:w="1399"/>
+          </w:tcPr>
+          <w:p>
+            <w:r>
+              <w:t>Hon. Saidu Ahmed Alkali</w:t>
+            </w:r>
+          </w:p>
+        </w:tc>
+        <w:tc>
+          <w:tcPr>
+            <w:tcW w:type="dxa" w:w="1399"/>
+          </w:tcPr>
+          <w:p>
+            <w:r>
+              <w:t>Major leadership roles</w:t>
+            </w:r>
+          </w:p>
+        </w:tc>
+        <w:tc>
+          <w:tcPr>
+            <w:tcW w:type="dxa" w:w="1399"/>
+          </w:tcPr>
+          <w:p>
+            <w:r>
+              <w:t>2023-present</w:t>
+            </w:r>
+          </w:p>
+        </w:tc>
+        <w:tc>
+          <w:tcPr>
+            <w:tcW w:type="dxa" w:w="1399"/>
+          </w:tcPr>
+          <w:p>
+            <w:r>
+              <w:t>Minister of Transportation</w:t>
+            </w:r>
+          </w:p>
+        </w:tc>
+        <w:tc>
+          <w:tcPr>
+            <w:tcW w:type="dxa" w:w="1399"/>
+          </w:tcPr>
+          <w:p>
+            <w:r>
+              <w:t>Federal Ministry of Transportation</w:t>
+            </w:r>
+          </w:p>
+        </w:tc>
+        <w:tc>
+          <w:tcPr>
+            <w:tcW w:type="dxa" w:w="1399"/>
+          </w:tcPr>
+          <w:p>
+            <w:r>
+              <w:t>SRC013</w:t>
+            </w:r>
+          </w:p>
+        </w:tc>
+        <w:tc>
+          <w:tcPr>
+            <w:tcW w:type="dxa" w:w="1399"/>
+          </w:tcPr>
+          <w:p>
+            <w:r>
+              <w:t>75</w:t>
+            </w:r>
+          </w:p>
+        </w:tc>
+      </w:tr>
+      <w:tr>
+        <w:tc>
+          <w:tcPr>
+            <w:tcW w:type="dxa" w:w="1399"/>
+          </w:tcPr>
+          <w:p>
+            <w:r>
+              <w:t>Hon. Saidu Ahmed Alkali</w:t>
+            </w:r>
+          </w:p>
+        </w:tc>
+        <w:tc>
+          <w:tcPr>
+            <w:tcW w:type="dxa" w:w="1399"/>
+          </w:tcPr>
+          <w:p>
+            <w:r>
+              <w:t>Major achievements</w:t>
+            </w:r>
+          </w:p>
+        </w:tc>
+        <w:tc>
+          <w:tcPr>
+            <w:tcW w:type="dxa" w:w="1399"/>
+          </w:tcPr>
+          <w:p>
+            <w:r>
+              <w:t>2024</w:t>
+            </w:r>
+          </w:p>
+        </w:tc>
+        <w:tc>
+          <w:tcPr>
+            <w:tcW w:type="dxa" w:w="1399"/>
+          </w:tcPr>
+          <w:p>
+            <w:r>
+              <w:t>Kano-Maradi and Kaduna-Kano rail project inspections</w:t>
+            </w:r>
+          </w:p>
+        </w:tc>
+        <w:tc>
+          <w:tcPr>
+            <w:tcW w:type="dxa" w:w="1399"/>
+          </w:tcPr>
+          <w:p>
+            <w:r>
+              <w:t>Federal Ministry of Transportation</w:t>
+            </w:r>
+          </w:p>
+        </w:tc>
+        <w:tc>
+          <w:tcPr>
+            <w:tcW w:type="dxa" w:w="1399"/>
+          </w:tcPr>
+          <w:p>
+            <w:r>
+              <w:t>SRC016</w:t>
+            </w:r>
+          </w:p>
+        </w:tc>
+        <w:tc>
+          <w:tcPr>
+            <w:tcW w:type="dxa" w:w="1399"/>
+          </w:tcPr>
+          <w:p>
+            <w:r>
+              <w:t>82</w:t>
             </w:r>
           </w:p>
         </w:tc>

</xml_diff>